<commit_message>
Update public RARP triplet Word guideline
</commit_message>
<xml_diff>
--- a/static/guidelines/RARP_guideline_triplet.docx
+++ b/static/guidelines/RARP_guideline_triplet.docx
@@ -4,7 +4,6 @@
   <w:body>
     <w:p>
       <w:pPr>
-        <w:spacing w:after="0" w:line="10" w:lineRule="atLeast"/>
         <w:rPr>
           <w:rFonts w:eastAsiaTheme="minorHAnsi" w:hint="eastAsia"/>
           <w:b/>
@@ -15,466 +14,12 @@
       </w:pPr>
       <w:r>
         <w:rPr>
-          <w:rFonts w:eastAsiaTheme="minorHAnsi"/>
+          <w:rFonts w:eastAsiaTheme="minorHAnsi" w:hint="eastAsia"/>
           <w:b/>
           <w:bCs/>
           <w:sz w:val="28"/>
           <w:szCs w:val="28"/>
         </w:rPr>
-        <w:t>Key step characteristics</w:t>
-      </w:r>
-    </w:p>
-    <w:p>
-      <w:pPr>
-        <w:spacing w:after="0"/>
-        <w:rPr>
-          <w:rFonts w:eastAsiaTheme="minorHAnsi" w:hint="eastAsia"/>
-          <w:sz w:val="18"/>
-          <w:szCs w:val="18"/>
-        </w:rPr>
-      </w:pPr>
-      <w:r>
-        <w:rPr>
-          <w:rFonts w:eastAsiaTheme="minorHAnsi"/>
-          <w:sz w:val="18"/>
-          <w:szCs w:val="18"/>
-        </w:rPr>
-        <w:t>Step 0 – Idle: No active surgical step is being performed, or the operation is in a transition state.</w:t>
-      </w:r>
-    </w:p>
-    <w:p>
-      <w:pPr>
-        <w:spacing w:after="0"/>
-        <w:rPr>
-          <w:rFonts w:eastAsiaTheme="minorHAnsi" w:hint="eastAsia"/>
-          <w:sz w:val="18"/>
-          <w:szCs w:val="18"/>
-        </w:rPr>
-      </w:pPr>
-      <w:r>
-        <w:rPr>
-          <w:rFonts w:eastAsiaTheme="minorHAnsi"/>
-          <w:sz w:val="18"/>
-          <w:szCs w:val="18"/>
-        </w:rPr>
-        <w:t>Step 1 – Identification and dissection of the Iliac vein and artery: Identify the iliac vessels and dissect the surrounding tissue to expose the operative field.</w:t>
-      </w:r>
-    </w:p>
-    <w:p>
-      <w:pPr>
-        <w:spacing w:after="0"/>
-        <w:rPr>
-          <w:rFonts w:eastAsiaTheme="minorHAnsi" w:hint="eastAsia"/>
-          <w:sz w:val="18"/>
-          <w:szCs w:val="18"/>
-        </w:rPr>
-      </w:pPr>
-      <w:r>
-        <w:rPr>
-          <w:rFonts w:eastAsiaTheme="minorHAnsi"/>
-          <w:sz w:val="18"/>
-          <w:szCs w:val="18"/>
-        </w:rPr>
-        <w:t>Step 2 – Cutting and dissection of the external iliac vein’s lymph node: Dissect and remove lymphatic tissue around the external iliac vein.</w:t>
-      </w:r>
-    </w:p>
-    <w:p>
-      <w:pPr>
-        <w:spacing w:after="0"/>
-        <w:rPr>
-          <w:rFonts w:eastAsiaTheme="minorHAnsi" w:hint="eastAsia"/>
-          <w:sz w:val="18"/>
-          <w:szCs w:val="18"/>
-        </w:rPr>
-      </w:pPr>
-      <w:r>
-        <w:rPr>
-          <w:rFonts w:eastAsiaTheme="minorHAnsi"/>
-          <w:sz w:val="18"/>
-          <w:szCs w:val="18"/>
-        </w:rPr>
-        <w:t>Step 3 – Obturator nerve and vessel path identification, dissection, and cutting of the obturator lymph nodes: Identify the obturator nerve and vessels, then dissect and remove the obturator lymph nodes.</w:t>
-      </w:r>
-    </w:p>
-    <w:p>
-      <w:pPr>
-        <w:spacing w:after="0"/>
-        <w:rPr>
-          <w:rFonts w:eastAsiaTheme="minorHAnsi" w:hint="eastAsia"/>
-          <w:sz w:val="18"/>
-          <w:szCs w:val="18"/>
-        </w:rPr>
-      </w:pPr>
-      <w:r>
-        <w:rPr>
-          <w:rFonts w:eastAsiaTheme="minorHAnsi"/>
-          <w:sz w:val="18"/>
-          <w:szCs w:val="18"/>
-        </w:rPr>
-        <w:t>Step 4 – Insert the lymph nodes in retrieval bags: Place the dissected lymph nodes into a retrieval bag for specimen collection.</w:t>
-      </w:r>
-    </w:p>
-    <w:p>
-      <w:pPr>
-        <w:spacing w:after="0"/>
-        <w:rPr>
-          <w:rFonts w:eastAsiaTheme="minorHAnsi" w:hint="eastAsia"/>
-          <w:sz w:val="18"/>
-          <w:szCs w:val="18"/>
-        </w:rPr>
-      </w:pPr>
-      <w:r>
-        <w:rPr>
-          <w:rFonts w:eastAsiaTheme="minorHAnsi"/>
-          <w:sz w:val="18"/>
-          <w:szCs w:val="18"/>
-        </w:rPr>
-        <w:t xml:space="preserve">Step 5 – </w:t>
-      </w:r>
-      <w:proofErr w:type="spellStart"/>
-      <w:r>
-        <w:rPr>
-          <w:rFonts w:eastAsiaTheme="minorHAnsi"/>
-          <w:sz w:val="18"/>
-          <w:szCs w:val="18"/>
-        </w:rPr>
-        <w:t>Prevessical</w:t>
-      </w:r>
-      <w:proofErr w:type="spellEnd"/>
-      <w:r>
-        <w:rPr>
-          <w:rFonts w:eastAsiaTheme="minorHAnsi"/>
-          <w:sz w:val="18"/>
-          <w:szCs w:val="18"/>
-        </w:rPr>
-        <w:t xml:space="preserve"> dissection: Dissect the prevesical space and surrounding tissue to continue exposure of the surgical field.</w:t>
-      </w:r>
-    </w:p>
-    <w:p>
-      <w:pPr>
-        <w:spacing w:after="0"/>
-        <w:rPr>
-          <w:rFonts w:eastAsiaTheme="minorHAnsi" w:hint="eastAsia"/>
-          <w:sz w:val="18"/>
-          <w:szCs w:val="18"/>
-        </w:rPr>
-      </w:pPr>
-      <w:r>
-        <w:rPr>
-          <w:rFonts w:eastAsiaTheme="minorHAnsi"/>
-          <w:sz w:val="18"/>
-          <w:szCs w:val="18"/>
-        </w:rPr>
-        <w:t>Step 6 – Ligation of the dorsal venous complex: Ligate the dorsal venous complex (DVC) to control bleeding before further dissection.</w:t>
-      </w:r>
-    </w:p>
-    <w:p>
-      <w:pPr>
-        <w:spacing w:after="0"/>
-        <w:rPr>
-          <w:rFonts w:eastAsiaTheme="minorHAnsi" w:hint="eastAsia"/>
-          <w:sz w:val="18"/>
-          <w:szCs w:val="18"/>
-        </w:rPr>
-      </w:pPr>
-      <w:r>
-        <w:rPr>
-          <w:rFonts w:eastAsiaTheme="minorHAnsi"/>
-          <w:sz w:val="18"/>
-          <w:szCs w:val="18"/>
-        </w:rPr>
-        <w:t>Step 7 – Prostate dissection until the levator ani: Continue prostate dissection downward until reaching the levator ani muscle.</w:t>
-      </w:r>
-    </w:p>
-    <w:p>
-      <w:pPr>
-        <w:spacing w:after="0"/>
-        <w:rPr>
-          <w:rFonts w:eastAsiaTheme="minorHAnsi" w:hint="eastAsia"/>
-          <w:sz w:val="18"/>
-          <w:szCs w:val="18"/>
-        </w:rPr>
-      </w:pPr>
-      <w:r>
-        <w:rPr>
-          <w:rFonts w:eastAsiaTheme="minorHAnsi"/>
-          <w:sz w:val="18"/>
-          <w:szCs w:val="18"/>
-        </w:rPr>
-        <w:t>Step 8 – Seminal vesicle dissection: Dissect and expose the seminal vesicles.</w:t>
-      </w:r>
-    </w:p>
-    <w:p>
-      <w:pPr>
-        <w:spacing w:after="0"/>
-        <w:rPr>
-          <w:rFonts w:eastAsiaTheme="minorHAnsi" w:hint="eastAsia"/>
-          <w:sz w:val="18"/>
-          <w:szCs w:val="18"/>
-        </w:rPr>
-      </w:pPr>
-      <w:r>
-        <w:rPr>
-          <w:rFonts w:eastAsiaTheme="minorHAnsi"/>
-          <w:sz w:val="18"/>
-          <w:szCs w:val="18"/>
-        </w:rPr>
-        <w:t xml:space="preserve">Step 9 – Dissection of </w:t>
-      </w:r>
-      <w:proofErr w:type="spellStart"/>
-      <w:r>
-        <w:rPr>
-          <w:rFonts w:eastAsiaTheme="minorHAnsi"/>
-          <w:sz w:val="18"/>
-          <w:szCs w:val="18"/>
-        </w:rPr>
-        <w:t>Denonvilliers</w:t>
-      </w:r>
-      <w:proofErr w:type="spellEnd"/>
-      <w:r>
-        <w:rPr>
-          <w:rFonts w:eastAsiaTheme="minorHAnsi"/>
-          <w:sz w:val="18"/>
-          <w:szCs w:val="18"/>
-        </w:rPr>
-        <w:t xml:space="preserve">’ fascia: Dissect </w:t>
-      </w:r>
-      <w:proofErr w:type="spellStart"/>
-      <w:r>
-        <w:rPr>
-          <w:rFonts w:eastAsiaTheme="minorHAnsi"/>
-          <w:sz w:val="18"/>
-          <w:szCs w:val="18"/>
-        </w:rPr>
-        <w:t>Denonvilliers</w:t>
-      </w:r>
-      <w:proofErr w:type="spellEnd"/>
-      <w:r>
-        <w:rPr>
-          <w:rFonts w:eastAsiaTheme="minorHAnsi"/>
-          <w:sz w:val="18"/>
-          <w:szCs w:val="18"/>
-        </w:rPr>
-        <w:t>’ fascia to separate the prostate from the rectal plane.</w:t>
-      </w:r>
-    </w:p>
-    <w:p>
-      <w:pPr>
-        <w:spacing w:after="0"/>
-        <w:rPr>
-          <w:rFonts w:eastAsiaTheme="minorHAnsi" w:hint="eastAsia"/>
-          <w:sz w:val="18"/>
-          <w:szCs w:val="18"/>
-        </w:rPr>
-      </w:pPr>
-      <w:r>
-        <w:rPr>
-          <w:rFonts w:eastAsiaTheme="minorHAnsi"/>
-          <w:sz w:val="18"/>
-          <w:szCs w:val="18"/>
-        </w:rPr>
-        <w:t>Step 10 – Cut the tissue between the prostate and the urethra: Transect the tissue connecting the prostate and urethra in preparation for separation.</w:t>
-      </w:r>
-    </w:p>
-    <w:p>
-      <w:pPr>
-        <w:spacing w:after="0"/>
-        <w:rPr>
-          <w:rFonts w:eastAsiaTheme="minorHAnsi" w:hint="eastAsia"/>
-          <w:sz w:val="18"/>
-          <w:szCs w:val="18"/>
-        </w:rPr>
-      </w:pPr>
-      <w:r>
-        <w:rPr>
-          <w:rFonts w:eastAsiaTheme="minorHAnsi"/>
-          <w:sz w:val="18"/>
-          <w:szCs w:val="18"/>
-        </w:rPr>
-        <w:t>Step 11 – Hold prostate: Grasp and stabilize the prostate to facilitate the following surgical maneuvers.</w:t>
-      </w:r>
-    </w:p>
-    <w:p>
-      <w:pPr>
-        <w:spacing w:after="0"/>
-        <w:rPr>
-          <w:rFonts w:eastAsiaTheme="minorHAnsi" w:hint="eastAsia"/>
-          <w:sz w:val="18"/>
-          <w:szCs w:val="18"/>
-        </w:rPr>
-      </w:pPr>
-      <w:r>
-        <w:rPr>
-          <w:rFonts w:eastAsiaTheme="minorHAnsi"/>
-          <w:sz w:val="18"/>
-          <w:szCs w:val="18"/>
-        </w:rPr>
-        <w:t>Step 12 – Insert prostate in retrieval bag: Place the removed prostate specimen into a retrieval bag.</w:t>
-      </w:r>
-    </w:p>
-    <w:p>
-      <w:pPr>
-        <w:spacing w:after="0"/>
-        <w:rPr>
-          <w:rFonts w:eastAsiaTheme="minorHAnsi" w:hint="eastAsia"/>
-          <w:sz w:val="18"/>
-          <w:szCs w:val="18"/>
-        </w:rPr>
-      </w:pPr>
-      <w:r>
-        <w:rPr>
-          <w:rFonts w:eastAsiaTheme="minorHAnsi"/>
-          <w:sz w:val="18"/>
-          <w:szCs w:val="18"/>
-        </w:rPr>
-        <w:t>Step 13 – Pass suture to the urethra: Pass suture through the urethral stump in preparation for anastomosis.</w:t>
-      </w:r>
-    </w:p>
-    <w:p>
-      <w:pPr>
-        <w:spacing w:after="0"/>
-        <w:rPr>
-          <w:rFonts w:eastAsiaTheme="minorHAnsi" w:hint="eastAsia"/>
-          <w:sz w:val="18"/>
-          <w:szCs w:val="18"/>
-        </w:rPr>
-      </w:pPr>
-      <w:r>
-        <w:rPr>
-          <w:rFonts w:eastAsiaTheme="minorHAnsi"/>
-          <w:sz w:val="18"/>
-          <w:szCs w:val="18"/>
-        </w:rPr>
-        <w:t>Step 14 – Pass suture to the bladder neck: Pass suture through the bladder neck to prepare for vesicourethral anastomosis.</w:t>
-      </w:r>
-    </w:p>
-    <w:p>
-      <w:pPr>
-        <w:spacing w:after="0"/>
-        <w:rPr>
-          <w:rFonts w:eastAsiaTheme="minorHAnsi" w:hint="eastAsia"/>
-          <w:sz w:val="18"/>
-          <w:szCs w:val="18"/>
-        </w:rPr>
-      </w:pPr>
-      <w:r>
-        <w:rPr>
-          <w:rFonts w:eastAsiaTheme="minorHAnsi"/>
-          <w:sz w:val="18"/>
-          <w:szCs w:val="18"/>
-        </w:rPr>
-        <w:t>Step 15 – Pull suture: Pull the suture to approximate the tissues and reduce the gap between the bladder neck and urethra.</w:t>
-      </w:r>
-    </w:p>
-    <w:p>
-      <w:pPr>
-        <w:spacing w:after="0"/>
-        <w:rPr>
-          <w:rFonts w:eastAsiaTheme="minorHAnsi" w:hint="eastAsia"/>
-          <w:sz w:val="18"/>
-          <w:szCs w:val="18"/>
-        </w:rPr>
-      </w:pPr>
-      <w:r>
-        <w:rPr>
-          <w:rFonts w:eastAsiaTheme="minorHAnsi"/>
-          <w:sz w:val="18"/>
-          <w:szCs w:val="18"/>
-        </w:rPr>
-        <w:t>Step 16 – Tie suture: Tie the suture to secure fixation, often stabilizing the anastomotic or adjacent structure.</w:t>
-      </w:r>
-    </w:p>
-    <w:p>
-      <w:pPr>
-        <w:spacing w:after="0"/>
-        <w:rPr>
-          <w:rFonts w:eastAsiaTheme="minorHAnsi" w:hint="eastAsia"/>
-          <w:sz w:val="18"/>
-          <w:szCs w:val="18"/>
-        </w:rPr>
-      </w:pPr>
-      <w:r>
-        <w:rPr>
-          <w:rFonts w:eastAsiaTheme="minorHAnsi"/>
-          <w:sz w:val="18"/>
-          <w:szCs w:val="18"/>
-        </w:rPr>
-        <w:t>Step 17 – Suction: Use the suction instrument to remove blood, fluid, or smoke and keep the surgical field clear.</w:t>
-      </w:r>
-    </w:p>
-    <w:p>
-      <w:pPr>
-        <w:spacing w:after="0"/>
-        <w:rPr>
-          <w:rFonts w:eastAsiaTheme="minorHAnsi" w:hint="eastAsia"/>
-          <w:sz w:val="18"/>
-          <w:szCs w:val="18"/>
-        </w:rPr>
-      </w:pPr>
-      <w:r>
-        <w:rPr>
-          <w:rFonts w:eastAsiaTheme="minorHAnsi"/>
-          <w:sz w:val="18"/>
-          <w:szCs w:val="18"/>
-        </w:rPr>
-        <w:t>Step 18 – Cut suture or tissue: Cut excess suture material or small tissue remnants as needed during the procedure.</w:t>
-      </w:r>
-    </w:p>
-    <w:p>
-      <w:pPr>
-        <w:spacing w:after="0"/>
-        <w:rPr>
-          <w:rFonts w:eastAsiaTheme="minorHAnsi" w:hint="eastAsia"/>
-          <w:sz w:val="18"/>
-          <w:szCs w:val="18"/>
-        </w:rPr>
-      </w:pPr>
-      <w:r>
-        <w:rPr>
-          <w:rFonts w:eastAsiaTheme="minorHAnsi"/>
-          <w:sz w:val="18"/>
-          <w:szCs w:val="18"/>
-        </w:rPr>
-        <w:t>Step 19 – Cut between the prostate and bladder neck: Transect the tissue plane between the prostate and bladder neck to separate them.</w:t>
-      </w:r>
-    </w:p>
-    <w:p>
-      <w:pPr>
-        <w:spacing w:after="0"/>
-        <w:rPr>
-          <w:rFonts w:eastAsiaTheme="minorHAnsi" w:hint="eastAsia"/>
-          <w:sz w:val="18"/>
-          <w:szCs w:val="18"/>
-        </w:rPr>
-      </w:pPr>
-      <w:r>
-        <w:rPr>
-          <w:rFonts w:eastAsiaTheme="minorHAnsi"/>
-          <w:sz w:val="18"/>
-          <w:szCs w:val="18"/>
-        </w:rPr>
-        <w:t>Step 20 – Vascular pedicle control: Control, seal, or divide the vascular pedicles supplying the prostate.</w:t>
-      </w:r>
-    </w:p>
-    <w:p>
-      <w:pPr>
-        <w:rPr>
-          <w:rFonts w:eastAsiaTheme="minorHAnsi" w:hint="eastAsia"/>
-          <w:b/>
-          <w:bCs/>
-          <w:sz w:val="28"/>
-          <w:szCs w:val="28"/>
-        </w:rPr>
-      </w:pPr>
-      <w:r>
-        <w:rPr>
-          <w:rFonts w:eastAsiaTheme="minorHAnsi" w:hint="eastAsia"/>
-          <w:b/>
-          <w:bCs/>
-          <w:sz w:val="28"/>
-          <w:szCs w:val="28"/>
-        </w:rPr>
-        <w:lastRenderedPageBreak/>
         <w:t>Instrument Label Space:</w:t>
       </w:r>
     </w:p>

</xml_diff>